<commit_message>
docx: add Appendix A — every training parameter (architecture, data, optimiser, loss weights, both runs' exact configs + commands, inference)
</commit_message>
<xml_diff>
--- a/docs/DRISHTI_project_explainer.docx
+++ b/docs/DRISHTI_project_explainer.docx
@@ -3410,6 +3410,2316 @@
         <w:t>Confidence is relative, not calibrated. It reliably ranks pixels by uncertainty; turning 'less certain' into a number of metres of expected error needs reference data.</w:t>
       </w:r>
     </w:p>
+    <w:p>
+      <w:r>
+        <w:br w:type="page"/>
+      </w:r>
+    </w:p>
+    <w:p>
+      <w:pPr>
+        <w:pStyle w:val="Heading1"/>
+      </w:pPr>
+      <w:r>
+        <w:t>Appendix A — Exact training configuration (every parameter)</w:t>
+      </w:r>
+    </w:p>
+    <w:p>
+      <w:r>
+        <w:rPr>
+          <w:b w:val="0"/>
+          <w:i w:val="0"/>
+        </w:rPr>
+        <w:t>Everything below is the actual setting used, not a recommendation. The command that reproduces each run is at the end of the appendix.</w:t>
+      </w:r>
+    </w:p>
+    <w:p>
+      <w:pPr>
+        <w:pStyle w:val="Heading2"/>
+      </w:pPr>
+      <w:r>
+        <w:t>A.1  Model architecture</w:t>
+      </w:r>
+    </w:p>
+    <w:tbl>
+      <w:tblPr>
+        <w:tblStyle w:val="LightGrid-Accent1"/>
+        <w:tblW w:type="auto" w:w="0"/>
+        <w:jc w:val="center"/>
+        <w:tblLook w:firstColumn="1" w:firstRow="1" w:lastColumn="0" w:lastRow="0" w:noHBand="0" w:noVBand="1" w:val="04A0"/>
+      </w:tblPr>
+      <w:tblGrid>
+        <w:gridCol w:w="4320"/>
+        <w:gridCol w:w="4320"/>
+      </w:tblGrid>
+      <w:tr>
+        <w:tc>
+          <w:tcPr>
+            <w:tcW w:type="dxa" w:w="3600"/>
+          </w:tcPr>
+          <w:p>
+            <w:r>
+              <w:rPr>
+                <w:b/>
+              </w:rPr>
+              <w:t>Parameter</w:t>
+            </w:r>
+          </w:p>
+        </w:tc>
+        <w:tc>
+          <w:tcPr>
+            <w:tcW w:type="dxa" w:w="5760"/>
+          </w:tcPr>
+          <w:p>
+            <w:r>
+              <w:rPr>
+                <w:b/>
+              </w:rPr>
+              <w:t>Value</w:t>
+            </w:r>
+          </w:p>
+        </w:tc>
+      </w:tr>
+      <w:tr>
+        <w:tc>
+          <w:tcPr>
+            <w:tcW w:type="dxa" w:w="3600"/>
+          </w:tcPr>
+          <w:p>
+            <w:r>
+              <w:rPr>
+                <w:sz w:val="19"/>
+              </w:rPr>
+              <w:t>Input / output bands</w:t>
+            </w:r>
+          </w:p>
+        </w:tc>
+        <w:tc>
+          <w:tcPr>
+            <w:tcW w:type="dxa" w:w="5760"/>
+          </w:tcPr>
+          <w:p>
+            <w:r>
+              <w:rPr>
+                <w:sz w:val="19"/>
+              </w:rPr>
+              <w:t>4  (B02 blue, B03 green, B04 red, B08 near-infrared)</w:t>
+            </w:r>
+          </w:p>
+        </w:tc>
+      </w:tr>
+      <w:tr>
+        <w:tc>
+          <w:tcPr>
+            <w:tcW w:type="dxa" w:w="3600"/>
+          </w:tcPr>
+          <w:p>
+            <w:r>
+              <w:rPr>
+                <w:sz w:val="19"/>
+              </w:rPr>
+              <w:t>Scale factor</w:t>
+            </w:r>
+          </w:p>
+        </w:tc>
+        <w:tc>
+          <w:tcPr>
+            <w:tcW w:type="dxa" w:w="5760"/>
+          </w:tcPr>
+          <w:p>
+            <w:r>
+              <w:rPr>
+                <w:sz w:val="19"/>
+              </w:rPr>
+              <w:t>4  (10 m -&gt; 2.5 m); no other scale is used anywhere</w:t>
+            </w:r>
+          </w:p>
+        </w:tc>
+      </w:tr>
+      <w:tr>
+        <w:tc>
+          <w:tcPr>
+            <w:tcW w:type="dxa" w:w="3600"/>
+          </w:tcPr>
+          <w:p>
+            <w:r>
+              <w:rPr>
+                <w:sz w:val="19"/>
+              </w:rPr>
+              <w:t>Feature width (channels)</w:t>
+            </w:r>
+          </w:p>
+        </w:tc>
+        <w:tc>
+          <w:tcPr>
+            <w:tcW w:type="dxa" w:w="5760"/>
+          </w:tcPr>
+          <w:p>
+            <w:r>
+              <w:rPr>
+                <w:sz w:val="19"/>
+              </w:rPr>
+              <w:t>96</w:t>
+            </w:r>
+          </w:p>
+        </w:tc>
+      </w:tr>
+      <w:tr>
+        <w:tc>
+          <w:tcPr>
+            <w:tcW w:type="dxa" w:w="3600"/>
+          </w:tcPr>
+          <w:p>
+            <w:r>
+              <w:rPr>
+                <w:sz w:val="19"/>
+              </w:rPr>
+              <w:t>Shallow head</w:t>
+            </w:r>
+          </w:p>
+        </w:tc>
+        <w:tc>
+          <w:tcPr>
+            <w:tcW w:type="dxa" w:w="5760"/>
+          </w:tcPr>
+          <w:p>
+            <w:r>
+              <w:rPr>
+                <w:sz w:val="19"/>
+              </w:rPr>
+              <w:t>1 conv 3x3,  4 -&gt; 96 channels</w:t>
+            </w:r>
+          </w:p>
+        </w:tc>
+      </w:tr>
+      <w:tr>
+        <w:tc>
+          <w:tcPr>
+            <w:tcW w:type="dxa" w:w="3600"/>
+          </w:tcPr>
+          <w:p>
+            <w:r>
+              <w:rPr>
+                <w:sz w:val="19"/>
+              </w:rPr>
+              <w:t>CNN branch</w:t>
+            </w:r>
+          </w:p>
+        </w:tc>
+        <w:tc>
+          <w:tcPr>
+            <w:tcW w:type="dxa" w:w="5760"/>
+          </w:tcPr>
+          <w:p>
+            <w:r>
+              <w:rPr>
+                <w:sz w:val="19"/>
+              </w:rPr>
+              <w:t>12 Residual Channel-Attention Blocks (RCAB)</w:t>
+            </w:r>
+          </w:p>
+        </w:tc>
+      </w:tr>
+      <w:tr>
+        <w:tc>
+          <w:tcPr>
+            <w:tcW w:type="dxa" w:w="3600"/>
+          </w:tcPr>
+          <w:p>
+            <w:r>
+              <w:rPr>
+                <w:sz w:val="19"/>
+              </w:rPr>
+              <w:t xml:space="preserve">   - block internals</w:t>
+            </w:r>
+          </w:p>
+        </w:tc>
+        <w:tc>
+          <w:tcPr>
+            <w:tcW w:type="dxa" w:w="5760"/>
+          </w:tcPr>
+          <w:p>
+            <w:r>
+              <w:rPr>
+                <w:sz w:val="19"/>
+              </w:rPr>
+              <w:t>conv3x3 -&gt; ReLU -&gt; conv3x3 -&gt; channel attention; residual scale 0.1</w:t>
+            </w:r>
+          </w:p>
+        </w:tc>
+      </w:tr>
+      <w:tr>
+        <w:tc>
+          <w:tcPr>
+            <w:tcW w:type="dxa" w:w="3600"/>
+          </w:tcPr>
+          <w:p>
+            <w:r>
+              <w:rPr>
+                <w:sz w:val="19"/>
+              </w:rPr>
+              <w:t xml:space="preserve">   - channel-attention reduction</w:t>
+            </w:r>
+          </w:p>
+        </w:tc>
+        <w:tc>
+          <w:tcPr>
+            <w:tcW w:type="dxa" w:w="5760"/>
+          </w:tcPr>
+          <w:p>
+            <w:r>
+              <w:rPr>
+                <w:sz w:val="19"/>
+              </w:rPr>
+              <w:t>8  (min 4)</w:t>
+            </w:r>
+          </w:p>
+        </w:tc>
+      </w:tr>
+      <w:tr>
+        <w:tc>
+          <w:tcPr>
+            <w:tcW w:type="dxa" w:w="3600"/>
+          </w:tcPr>
+          <w:p>
+            <w:r>
+              <w:rPr>
+                <w:sz w:val="19"/>
+              </w:rPr>
+              <w:t>Transformer branch</w:t>
+            </w:r>
+          </w:p>
+        </w:tc>
+        <w:tc>
+          <w:tcPr>
+            <w:tcW w:type="dxa" w:w="5760"/>
+          </w:tcPr>
+          <w:p>
+            <w:r>
+              <w:rPr>
+                <w:sz w:val="19"/>
+              </w:rPr>
+              <w:t>6 Swin blocks, window size 8, 4 attention heads, MLP ratio 2.0</w:t>
+            </w:r>
+          </w:p>
+        </w:tc>
+      </w:tr>
+      <w:tr>
+        <w:tc>
+          <w:tcPr>
+            <w:tcW w:type="dxa" w:w="3600"/>
+          </w:tcPr>
+          <w:p>
+            <w:r>
+              <w:rPr>
+                <w:sz w:val="19"/>
+              </w:rPr>
+              <w:t xml:space="preserve">   - window shift</w:t>
+            </w:r>
+          </w:p>
+        </w:tc>
+        <w:tc>
+          <w:tcPr>
+            <w:tcW w:type="dxa" w:w="5760"/>
+          </w:tcPr>
+          <w:p>
+            <w:r>
+              <w:rPr>
+                <w:sz w:val="19"/>
+              </w:rPr>
+              <w:t>alternating 0 and 4 (window/2) between consecutive blocks</w:t>
+            </w:r>
+          </w:p>
+        </w:tc>
+      </w:tr>
+      <w:tr>
+        <w:tc>
+          <w:tcPr>
+            <w:tcW w:type="dxa" w:w="3600"/>
+          </w:tcPr>
+          <w:p>
+            <w:r>
+              <w:rPr>
+                <w:sz w:val="19"/>
+              </w:rPr>
+              <w:t xml:space="preserve">   - position bias</w:t>
+            </w:r>
+          </w:p>
+        </w:tc>
+        <w:tc>
+          <w:tcPr>
+            <w:tcW w:type="dxa" w:w="5760"/>
+          </w:tcPr>
+          <w:p>
+            <w:r>
+              <w:rPr>
+                <w:sz w:val="19"/>
+              </w:rPr>
+              <w:t>learned relative-position bias per head</w:t>
+            </w:r>
+          </w:p>
+        </w:tc>
+      </w:tr>
+      <w:tr>
+        <w:tc>
+          <w:tcPr>
+            <w:tcW w:type="dxa" w:w="3600"/>
+          </w:tcPr>
+          <w:p>
+            <w:r>
+              <w:rPr>
+                <w:sz w:val="19"/>
+              </w:rPr>
+              <w:t>Gate</w:t>
+            </w:r>
+          </w:p>
+        </w:tc>
+        <w:tc>
+          <w:tcPr>
+            <w:tcW w:type="dxa" w:w="5760"/>
+          </w:tcPr>
+          <w:p>
+            <w:r>
+              <w:rPr>
+                <w:sz w:val="19"/>
+              </w:rPr>
+              <w:t>conv 1x1,  192 -&gt; 96,  then sigmoid;  fused = w*CNN + (1-w)*Swin</w:t>
+            </w:r>
+          </w:p>
+        </w:tc>
+      </w:tr>
+      <w:tr>
+        <w:tc>
+          <w:tcPr>
+            <w:tcW w:type="dxa" w:w="3600"/>
+          </w:tcPr>
+          <w:p>
+            <w:r>
+              <w:rPr>
+                <w:sz w:val="19"/>
+              </w:rPr>
+              <w:t>Fusion conv</w:t>
+            </w:r>
+          </w:p>
+        </w:tc>
+        <w:tc>
+          <w:tcPr>
+            <w:tcW w:type="dxa" w:w="5760"/>
+          </w:tcPr>
+          <w:p>
+            <w:r>
+              <w:rPr>
+                <w:sz w:val="19"/>
+              </w:rPr>
+              <w:t>conv 3x3, 96 -&gt; 96, with the shallow features added back</w:t>
+            </w:r>
+          </w:p>
+        </w:tc>
+      </w:tr>
+      <w:tr>
+        <w:tc>
+          <w:tcPr>
+            <w:tcW w:type="dxa" w:w="3600"/>
+          </w:tcPr>
+          <w:p>
+            <w:r>
+              <w:rPr>
+                <w:sz w:val="19"/>
+              </w:rPr>
+              <w:t>Dropout</w:t>
+            </w:r>
+          </w:p>
+        </w:tc>
+        <w:tc>
+          <w:tcPr>
+            <w:tcW w:type="dxa" w:w="5760"/>
+          </w:tcPr>
+          <w:p>
+            <w:r>
+              <w:rPr>
+                <w:sz w:val="19"/>
+              </w:rPr>
+              <w:t>one Dropout2d, p = 0.1  (kept ON at inference for the confidence map)</w:t>
+            </w:r>
+          </w:p>
+        </w:tc>
+      </w:tr>
+      <w:tr>
+        <w:tc>
+          <w:tcPr>
+            <w:tcW w:type="dxa" w:w="3600"/>
+          </w:tcPr>
+          <w:p>
+            <w:r>
+              <w:rPr>
+                <w:sz w:val="19"/>
+              </w:rPr>
+              <w:t>Upsampling</w:t>
+            </w:r>
+          </w:p>
+        </w:tc>
+        <w:tc>
+          <w:tcPr>
+            <w:tcW w:type="dxa" w:w="5760"/>
+          </w:tcPr>
+          <w:p>
+            <w:r>
+              <w:rPr>
+                <w:sz w:val="19"/>
+              </w:rPr>
+              <w:t>2 x [conv3x3 96-&gt;384, PixelShuffle x2, ReLU]  = x4 total</w:t>
+            </w:r>
+          </w:p>
+        </w:tc>
+      </w:tr>
+      <w:tr>
+        <w:tc>
+          <w:tcPr>
+            <w:tcW w:type="dxa" w:w="3600"/>
+          </w:tcPr>
+          <w:p>
+            <w:r>
+              <w:rPr>
+                <w:sz w:val="19"/>
+              </w:rPr>
+              <w:t>Tail</w:t>
+            </w:r>
+          </w:p>
+        </w:tc>
+        <w:tc>
+          <w:tcPr>
+            <w:tcW w:type="dxa" w:w="5760"/>
+          </w:tcPr>
+          <w:p>
+            <w:r>
+              <w:rPr>
+                <w:sz w:val="19"/>
+              </w:rPr>
+              <w:t>conv 3x3,  96 -&gt; 4 bands</w:t>
+            </w:r>
+          </w:p>
+        </w:tc>
+      </w:tr>
+      <w:tr>
+        <w:tc>
+          <w:tcPr>
+            <w:tcW w:type="dxa" w:w="3600"/>
+          </w:tcPr>
+          <w:p>
+            <w:r>
+              <w:rPr>
+                <w:sz w:val="19"/>
+              </w:rPr>
+              <w:t>Low-frequency constraint</w:t>
+            </w:r>
+          </w:p>
+        </w:tc>
+        <w:tc>
+          <w:tcPr>
+            <w:tcW w:type="dxa" w:w="5760"/>
+          </w:tcPr>
+          <w:p>
+            <w:r>
+              <w:rPr>
+                <w:sz w:val="19"/>
+              </w:rPr>
+              <w:t>SR = raw + nearest_up(LR - avg_pool4(raw))  -- exact, always on</w:t>
+            </w:r>
+          </w:p>
+        </w:tc>
+      </w:tr>
+      <w:tr>
+        <w:tc>
+          <w:tcPr>
+            <w:tcW w:type="dxa" w:w="3600"/>
+          </w:tcPr>
+          <w:p>
+            <w:r>
+              <w:rPr>
+                <w:sz w:val="19"/>
+              </w:rPr>
+              <w:t>Total trainable parameters</w:t>
+            </w:r>
+          </w:p>
+        </w:tc>
+        <w:tc>
+          <w:tcPr>
+            <w:tcW w:type="dxa" w:w="5760"/>
+          </w:tcPr>
+          <w:p>
+            <w:r>
+              <w:rPr>
+                <w:sz w:val="19"/>
+              </w:rPr>
+              <w:t>3,414,988</w:t>
+            </w:r>
+          </w:p>
+        </w:tc>
+      </w:tr>
+    </w:tbl>
+    <w:p/>
+    <w:p>
+      <w:pPr>
+        <w:pStyle w:val="Heading2"/>
+      </w:pPr>
+      <w:r>
+        <w:t>A.2  Data pipeline</w:t>
+      </w:r>
+    </w:p>
+    <w:tbl>
+      <w:tblPr>
+        <w:tblStyle w:val="LightGrid-Accent1"/>
+        <w:tblW w:type="auto" w:w="0"/>
+        <w:jc w:val="center"/>
+        <w:tblLook w:firstColumn="1" w:firstRow="1" w:lastColumn="0" w:lastRow="0" w:noHBand="0" w:noVBand="1" w:val="04A0"/>
+      </w:tblPr>
+      <w:tblGrid>
+        <w:gridCol w:w="4320"/>
+        <w:gridCol w:w="4320"/>
+      </w:tblGrid>
+      <w:tr>
+        <w:tc>
+          <w:tcPr>
+            <w:tcW w:type="dxa" w:w="3312"/>
+          </w:tcPr>
+          <w:p>
+            <w:r>
+              <w:rPr>
+                <w:b/>
+              </w:rPr>
+              <w:t>Parameter</w:t>
+            </w:r>
+          </w:p>
+        </w:tc>
+        <w:tc>
+          <w:tcPr>
+            <w:tcW w:type="dxa" w:w="6048"/>
+          </w:tcPr>
+          <w:p>
+            <w:r>
+              <w:rPr>
+                <w:b/>
+              </w:rPr>
+              <w:t>Value</w:t>
+            </w:r>
+          </w:p>
+        </w:tc>
+      </w:tr>
+      <w:tr>
+        <w:tc>
+          <w:tcPr>
+            <w:tcW w:type="dxa" w:w="3312"/>
+          </w:tcPr>
+          <w:p>
+            <w:r>
+              <w:rPr>
+                <w:sz w:val="19"/>
+              </w:rPr>
+              <w:t>Training scenes (12)</w:t>
+            </w:r>
+          </w:p>
+        </w:tc>
+        <w:tc>
+          <w:tcPr>
+            <w:tcW w:type="dxa" w:w="6048"/>
+          </w:tcPr>
+          <w:p>
+            <w:r>
+              <w:rPr>
+                <w:sz w:val="19"/>
+              </w:rPr>
+              <w:t>mumbai, nashik, pune, surat, ludhiana, nagpur, coimbatore, ahmedabad, hyderabad, jaipur, bhimavaram, indore</w:t>
+            </w:r>
+          </w:p>
+        </w:tc>
+      </w:tr>
+      <w:tr>
+        <w:tc>
+          <w:tcPr>
+            <w:tcW w:type="dxa" w:w="3312"/>
+          </w:tcPr>
+          <w:p>
+            <w:r>
+              <w:rPr>
+                <w:sz w:val="19"/>
+              </w:rPr>
+              <w:t>Held-out scene (1)</w:t>
+            </w:r>
+          </w:p>
+        </w:tc>
+        <w:tc>
+          <w:tcPr>
+            <w:tcW w:type="dxa" w:w="6048"/>
+          </w:tcPr>
+          <w:p>
+            <w:r>
+              <w:rPr>
+                <w:sz w:val="19"/>
+              </w:rPr>
+              <w:t>vasai  -- never sampled during training</w:t>
+            </w:r>
+          </w:p>
+        </w:tc>
+      </w:tr>
+      <w:tr>
+        <w:tc>
+          <w:tcPr>
+            <w:tcW w:type="dxa" w:w="3312"/>
+          </w:tcPr>
+          <w:p>
+            <w:r>
+              <w:rPr>
+                <w:sz w:val="19"/>
+              </w:rPr>
+              <w:t>Bands read</w:t>
+            </w:r>
+          </w:p>
+        </w:tc>
+        <w:tc>
+          <w:tcPr>
+            <w:tcW w:type="dxa" w:w="6048"/>
+          </w:tcPr>
+          <w:p>
+            <w:r>
+              <w:rPr>
+                <w:sz w:val="19"/>
+              </w:rPr>
+              <w:t>B02, B03, B04, B08  (from the 10-band fetched COG)</w:t>
+            </w:r>
+          </w:p>
+        </w:tc>
+      </w:tr>
+      <w:tr>
+        <w:tc>
+          <w:tcPr>
+            <w:tcW w:type="dxa" w:w="3312"/>
+          </w:tcPr>
+          <w:p>
+            <w:r>
+              <w:rPr>
+                <w:sz w:val="19"/>
+              </w:rPr>
+              <w:t>Reflectance handling</w:t>
+            </w:r>
+          </w:p>
+        </w:tc>
+        <w:tc>
+          <w:tcPr>
+            <w:tcW w:type="dxa" w:w="6048"/>
+          </w:tcPr>
+          <w:p>
+            <w:r>
+              <w:rPr>
+                <w:sz w:val="19"/>
+              </w:rPr>
+              <w:t>float32, values clipped to 0..1.5; scaled-integer files divided by 10000</w:t>
+            </w:r>
+          </w:p>
+        </w:tc>
+      </w:tr>
+      <w:tr>
+        <w:tc>
+          <w:tcPr>
+            <w:tcW w:type="dxa" w:w="3312"/>
+          </w:tcPr>
+          <w:p>
+            <w:r>
+              <w:rPr>
+                <w:sz w:val="19"/>
+              </w:rPr>
+              <w:t>Degrade operator (Wald)</w:t>
+            </w:r>
+          </w:p>
+        </w:tc>
+        <w:tc>
+          <w:tcPr>
+            <w:tcW w:type="dxa" w:w="6048"/>
+          </w:tcPr>
+          <w:p>
+            <w:r>
+              <w:rPr>
+                <w:sz w:val="19"/>
+              </w:rPr>
+              <w:t>box filter: avg_pool with kernel 4, stride 4  --  no Gaussian blur (sigma = 0)</w:t>
+            </w:r>
+          </w:p>
+        </w:tc>
+      </w:tr>
+      <w:tr>
+        <w:tc>
+          <w:tcPr>
+            <w:tcW w:type="dxa" w:w="3312"/>
+          </w:tcPr>
+          <w:p>
+            <w:r>
+              <w:rPr>
+                <w:sz w:val="19"/>
+              </w:rPr>
+              <w:t>HR training patch</w:t>
+            </w:r>
+          </w:p>
+        </w:tc>
+        <w:tc>
+          <w:tcPr>
+            <w:tcW w:type="dxa" w:w="6048"/>
+          </w:tcPr>
+          <w:p>
+            <w:r>
+              <w:rPr>
+                <w:sz w:val="19"/>
+              </w:rPr>
+              <w:t>256 x 256 pixels  (=&gt; 64 x 64 low-res input, made on the fly)</w:t>
+            </w:r>
+          </w:p>
+        </w:tc>
+      </w:tr>
+      <w:tr>
+        <w:tc>
+          <w:tcPr>
+            <w:tcW w:type="dxa" w:w="3312"/>
+          </w:tcPr>
+          <w:p>
+            <w:r>
+              <w:rPr>
+                <w:sz w:val="19"/>
+              </w:rPr>
+              <w:t>Minimum valid fraction</w:t>
+            </w:r>
+          </w:p>
+        </w:tc>
+        <w:tc>
+          <w:tcPr>
+            <w:tcW w:type="dxa" w:w="6048"/>
+          </w:tcPr>
+          <w:p>
+            <w:r>
+              <w:rPr>
+                <w:sz w:val="19"/>
+              </w:rPr>
+              <w:t>0.05  (near-empty crops are re-sampled, up to 20 tries)</w:t>
+            </w:r>
+          </w:p>
+        </w:tc>
+      </w:tr>
+      <w:tr>
+        <w:tc>
+          <w:tcPr>
+            <w:tcW w:type="dxa" w:w="3312"/>
+          </w:tcPr>
+          <w:p>
+            <w:r>
+              <w:rPr>
+                <w:sz w:val="19"/>
+              </w:rPr>
+              <w:t>Augmentation</w:t>
+            </w:r>
+          </w:p>
+        </w:tc>
+        <w:tc>
+          <w:tcPr>
+            <w:tcW w:type="dxa" w:w="6048"/>
+          </w:tcPr>
+          <w:p>
+            <w:r>
+              <w:rPr>
+                <w:sz w:val="19"/>
+              </w:rPr>
+              <w:t>random rot90 (0-3 turns) + horizontal flip (p 0.5) + vertical flip (p 0.5)</w:t>
+            </w:r>
+          </w:p>
+        </w:tc>
+      </w:tr>
+      <w:tr>
+        <w:tc>
+          <w:tcPr>
+            <w:tcW w:type="dxa" w:w="3312"/>
+          </w:tcPr>
+          <w:p>
+            <w:r>
+              <w:rPr>
+                <w:sz w:val="19"/>
+              </w:rPr>
+              <w:t>Dataset length</w:t>
+            </w:r>
+          </w:p>
+        </w:tc>
+        <w:tc>
+          <w:tcPr>
+            <w:tcW w:type="dxa" w:w="6048"/>
+          </w:tcPr>
+          <w:p>
+            <w:r>
+              <w:rPr>
+                <w:sz w:val="19"/>
+              </w:rPr>
+              <w:t>steps x batch  (one fresh random crop per item)</w:t>
+            </w:r>
+          </w:p>
+        </w:tc>
+      </w:tr>
+      <w:tr>
+        <w:tc>
+          <w:tcPr>
+            <w:tcW w:type="dxa" w:w="3312"/>
+          </w:tcPr>
+          <w:p>
+            <w:r>
+              <w:rPr>
+                <w:sz w:val="19"/>
+              </w:rPr>
+              <w:t>DataLoader</w:t>
+            </w:r>
+          </w:p>
+        </w:tc>
+        <w:tc>
+          <w:tcPr>
+            <w:tcW w:type="dxa" w:w="6048"/>
+          </w:tcPr>
+          <w:p>
+            <w:r>
+              <w:rPr>
+                <w:sz w:val="19"/>
+              </w:rPr>
+              <w:t>batch 8, shuffle off (dataset is already random), drop_last on, workers 0</w:t>
+            </w:r>
+          </w:p>
+        </w:tc>
+      </w:tr>
+    </w:tbl>
+    <w:p/>
+    <w:p>
+      <w:pPr>
+        <w:pStyle w:val="Heading2"/>
+      </w:pPr>
+      <w:r>
+        <w:t>A.3  Optimisation</w:t>
+      </w:r>
+    </w:p>
+    <w:tbl>
+      <w:tblPr>
+        <w:tblStyle w:val="LightGrid-Accent1"/>
+        <w:tblW w:type="auto" w:w="0"/>
+        <w:jc w:val="center"/>
+        <w:tblLook w:firstColumn="1" w:firstRow="1" w:lastColumn="0" w:lastRow="0" w:noHBand="0" w:noVBand="1" w:val="04A0"/>
+      </w:tblPr>
+      <w:tblGrid>
+        <w:gridCol w:w="4320"/>
+        <w:gridCol w:w="4320"/>
+      </w:tblGrid>
+      <w:tr>
+        <w:tc>
+          <w:tcPr>
+            <w:tcW w:type="dxa" w:w="3312"/>
+          </w:tcPr>
+          <w:p>
+            <w:r>
+              <w:rPr>
+                <w:b/>
+              </w:rPr>
+              <w:t>Parameter</w:t>
+            </w:r>
+          </w:p>
+        </w:tc>
+        <w:tc>
+          <w:tcPr>
+            <w:tcW w:type="dxa" w:w="6048"/>
+          </w:tcPr>
+          <w:p>
+            <w:r>
+              <w:rPr>
+                <w:b/>
+              </w:rPr>
+              <w:t>Value</w:t>
+            </w:r>
+          </w:p>
+        </w:tc>
+      </w:tr>
+      <w:tr>
+        <w:tc>
+          <w:tcPr>
+            <w:tcW w:type="dxa" w:w="3312"/>
+          </w:tcPr>
+          <w:p>
+            <w:r>
+              <w:rPr>
+                <w:sz w:val="19"/>
+              </w:rPr>
+              <w:t>Optimiser</w:t>
+            </w:r>
+          </w:p>
+        </w:tc>
+        <w:tc>
+          <w:tcPr>
+            <w:tcW w:type="dxa" w:w="6048"/>
+          </w:tcPr>
+          <w:p>
+            <w:r>
+              <w:rPr>
+                <w:sz w:val="19"/>
+              </w:rPr>
+              <w:t>AdamW</w:t>
+            </w:r>
+          </w:p>
+        </w:tc>
+      </w:tr>
+      <w:tr>
+        <w:tc>
+          <w:tcPr>
+            <w:tcW w:type="dxa" w:w="3312"/>
+          </w:tcPr>
+          <w:p>
+            <w:r>
+              <w:rPr>
+                <w:sz w:val="19"/>
+              </w:rPr>
+              <w:t>Betas</w:t>
+            </w:r>
+          </w:p>
+        </w:tc>
+        <w:tc>
+          <w:tcPr>
+            <w:tcW w:type="dxa" w:w="6048"/>
+          </w:tcPr>
+          <w:p>
+            <w:r>
+              <w:rPr>
+                <w:sz w:val="19"/>
+              </w:rPr>
+              <w:t>(0.9, 0.99)</w:t>
+            </w:r>
+          </w:p>
+        </w:tc>
+      </w:tr>
+      <w:tr>
+        <w:tc>
+          <w:tcPr>
+            <w:tcW w:type="dxa" w:w="3312"/>
+          </w:tcPr>
+          <w:p>
+            <w:r>
+              <w:rPr>
+                <w:sz w:val="19"/>
+              </w:rPr>
+              <w:t>Weight decay</w:t>
+            </w:r>
+          </w:p>
+        </w:tc>
+        <w:tc>
+          <w:tcPr>
+            <w:tcW w:type="dxa" w:w="6048"/>
+          </w:tcPr>
+          <w:p>
+            <w:r>
+              <w:rPr>
+                <w:sz w:val="19"/>
+              </w:rPr>
+              <w:t>1e-4</w:t>
+            </w:r>
+          </w:p>
+        </w:tc>
+      </w:tr>
+      <w:tr>
+        <w:tc>
+          <w:tcPr>
+            <w:tcW w:type="dxa" w:w="3312"/>
+          </w:tcPr>
+          <w:p>
+            <w:r>
+              <w:rPr>
+                <w:sz w:val="19"/>
+              </w:rPr>
+              <w:t>Gradient clipping</w:t>
+            </w:r>
+          </w:p>
+        </w:tc>
+        <w:tc>
+          <w:tcPr>
+            <w:tcW w:type="dxa" w:w="6048"/>
+          </w:tcPr>
+          <w:p>
+            <w:r>
+              <w:rPr>
+                <w:sz w:val="19"/>
+              </w:rPr>
+              <w:t>global norm 1.0</w:t>
+            </w:r>
+          </w:p>
+        </w:tc>
+      </w:tr>
+      <w:tr>
+        <w:tc>
+          <w:tcPr>
+            <w:tcW w:type="dxa" w:w="3312"/>
+          </w:tcPr>
+          <w:p>
+            <w:r>
+              <w:rPr>
+                <w:sz w:val="19"/>
+              </w:rPr>
+              <w:t>LR schedule</w:t>
+            </w:r>
+          </w:p>
+        </w:tc>
+        <w:tc>
+          <w:tcPr>
+            <w:tcW w:type="dxa" w:w="6048"/>
+          </w:tcPr>
+          <w:p>
+            <w:r>
+              <w:rPr>
+                <w:sz w:val="19"/>
+              </w:rPr>
+              <w:t>CosineAnnealingLR, T_max = steps, eta_min = 5% of the base LR</w:t>
+            </w:r>
+          </w:p>
+        </w:tc>
+      </w:tr>
+      <w:tr>
+        <w:tc>
+          <w:tcPr>
+            <w:tcW w:type="dxa" w:w="3312"/>
+          </w:tcPr>
+          <w:p>
+            <w:r>
+              <w:rPr>
+                <w:sz w:val="19"/>
+              </w:rPr>
+              <w:t>Precision</w:t>
+            </w:r>
+          </w:p>
+        </w:tc>
+        <w:tc>
+          <w:tcPr>
+            <w:tcW w:type="dxa" w:w="6048"/>
+          </w:tcPr>
+          <w:p>
+            <w:r>
+              <w:rPr>
+                <w:sz w:val="19"/>
+              </w:rPr>
+              <w:t>float32 (MPS)</w:t>
+            </w:r>
+          </w:p>
+        </w:tc>
+      </w:tr>
+      <w:tr>
+        <w:tc>
+          <w:tcPr>
+            <w:tcW w:type="dxa" w:w="3312"/>
+          </w:tcPr>
+          <w:p>
+            <w:r>
+              <w:rPr>
+                <w:sz w:val="19"/>
+              </w:rPr>
+              <w:t>Validation</w:t>
+            </w:r>
+          </w:p>
+        </w:tc>
+        <w:tc>
+          <w:tcPr>
+            <w:tcW w:type="dxa" w:w="6048"/>
+          </w:tcPr>
+          <w:p>
+            <w:r>
+              <w:rPr>
+                <w:sz w:val="19"/>
+              </w:rPr>
+              <w:t>fixed centre crop of the held-out scene, every 500 steps; best.pt kept on best validation PSNR</w:t>
+            </w:r>
+          </w:p>
+        </w:tc>
+      </w:tr>
+    </w:tbl>
+    <w:p/>
+    <w:p>
+      <w:pPr>
+        <w:pStyle w:val="Heading2"/>
+      </w:pPr>
+      <w:r>
+        <w:t>A.4  Loss weights</w:t>
+      </w:r>
+    </w:p>
+    <w:tbl>
+      <w:tblPr>
+        <w:tblStyle w:val="LightGrid-Accent1"/>
+        <w:tblW w:type="auto" w:w="0"/>
+        <w:jc w:val="center"/>
+        <w:tblLook w:firstColumn="1" w:firstRow="1" w:lastColumn="0" w:lastRow="0" w:noHBand="0" w:noVBand="1" w:val="04A0"/>
+      </w:tblPr>
+      <w:tblGrid>
+        <w:gridCol w:w="2880"/>
+        <w:gridCol w:w="2880"/>
+        <w:gridCol w:w="2880"/>
+      </w:tblGrid>
+      <w:tr>
+        <w:tc>
+          <w:tcPr>
+            <w:tcW w:type="dxa" w:w="4176"/>
+          </w:tcPr>
+          <w:p>
+            <w:r>
+              <w:rPr>
+                <w:b/>
+              </w:rPr>
+              <w:t>Term</w:t>
+            </w:r>
+          </w:p>
+        </w:tc>
+        <w:tc>
+          <w:tcPr>
+            <w:tcW w:type="dxa" w:w="2448"/>
+          </w:tcPr>
+          <w:p>
+            <w:r>
+              <w:rPr>
+                <w:b/>
+              </w:rPr>
+              <w:t>Base run</w:t>
+            </w:r>
+          </w:p>
+        </w:tc>
+        <w:tc>
+          <w:tcPr>
+            <w:tcW w:type="dxa" w:w="2736"/>
+          </w:tcPr>
+          <w:p>
+            <w:r>
+              <w:rPr>
+                <w:b/>
+              </w:rPr>
+              <w:t>Fine-tune</w:t>
+            </w:r>
+          </w:p>
+        </w:tc>
+      </w:tr>
+      <w:tr>
+        <w:tc>
+          <w:tcPr>
+            <w:tcW w:type="dxa" w:w="4176"/>
+          </w:tcPr>
+          <w:p>
+            <w:r>
+              <w:rPr>
+                <w:sz w:val="19"/>
+              </w:rPr>
+              <w:t>Reflectance L1  (w_l1)</w:t>
+            </w:r>
+          </w:p>
+        </w:tc>
+        <w:tc>
+          <w:tcPr>
+            <w:tcW w:type="dxa" w:w="2448"/>
+          </w:tcPr>
+          <w:p>
+            <w:r>
+              <w:rPr>
+                <w:sz w:val="19"/>
+              </w:rPr>
+              <w:t>1.00</w:t>
+            </w:r>
+          </w:p>
+        </w:tc>
+        <w:tc>
+          <w:tcPr>
+            <w:tcW w:type="dxa" w:w="2736"/>
+          </w:tcPr>
+          <w:p>
+            <w:r>
+              <w:rPr>
+                <w:sz w:val="19"/>
+              </w:rPr>
+              <w:t>1.00</w:t>
+            </w:r>
+          </w:p>
+        </w:tc>
+      </w:tr>
+      <w:tr>
+        <w:tc>
+          <w:tcPr>
+            <w:tcW w:type="dxa" w:w="4176"/>
+          </w:tcPr>
+          <w:p>
+            <w:r>
+              <w:rPr>
+                <w:sz w:val="19"/>
+              </w:rPr>
+              <w:t>Spectral Angle Mapper  (w_sam)</w:t>
+            </w:r>
+          </w:p>
+        </w:tc>
+        <w:tc>
+          <w:tcPr>
+            <w:tcW w:type="dxa" w:w="2448"/>
+          </w:tcPr>
+          <w:p>
+            <w:r>
+              <w:rPr>
+                <w:sz w:val="19"/>
+              </w:rPr>
+              <w:t>0.15</w:t>
+            </w:r>
+          </w:p>
+        </w:tc>
+        <w:tc>
+          <w:tcPr>
+            <w:tcW w:type="dxa" w:w="2736"/>
+          </w:tcPr>
+          <w:p>
+            <w:r>
+              <w:rPr>
+                <w:sz w:val="19"/>
+              </w:rPr>
+              <w:t>0.15</w:t>
+            </w:r>
+          </w:p>
+        </w:tc>
+      </w:tr>
+      <w:tr>
+        <w:tc>
+          <w:tcPr>
+            <w:tcW w:type="dxa" w:w="4176"/>
+          </w:tcPr>
+          <w:p>
+            <w:r>
+              <w:rPr>
+                <w:sz w:val="19"/>
+              </w:rPr>
+              <w:t>Downsample-consistency  (w_cons)</w:t>
+            </w:r>
+          </w:p>
+        </w:tc>
+        <w:tc>
+          <w:tcPr>
+            <w:tcW w:type="dxa" w:w="2448"/>
+          </w:tcPr>
+          <w:p>
+            <w:r>
+              <w:rPr>
+                <w:sz w:val="19"/>
+              </w:rPr>
+              <w:t>0.50</w:t>
+            </w:r>
+          </w:p>
+        </w:tc>
+        <w:tc>
+          <w:tcPr>
+            <w:tcW w:type="dxa" w:w="2736"/>
+          </w:tcPr>
+          <w:p>
+            <w:r>
+              <w:rPr>
+                <w:sz w:val="19"/>
+              </w:rPr>
+              <w:t>0.50</w:t>
+            </w:r>
+          </w:p>
+        </w:tc>
+      </w:tr>
+      <w:tr>
+        <w:tc>
+          <w:tcPr>
+            <w:tcW w:type="dxa" w:w="4176"/>
+          </w:tcPr>
+          <w:p>
+            <w:r>
+              <w:rPr>
+                <w:sz w:val="19"/>
+              </w:rPr>
+              <w:t>Edge / Sobel gradient  (w_grad)</w:t>
+            </w:r>
+          </w:p>
+        </w:tc>
+        <w:tc>
+          <w:tcPr>
+            <w:tcW w:type="dxa" w:w="2448"/>
+          </w:tcPr>
+          <w:p>
+            <w:r>
+              <w:rPr>
+                <w:sz w:val="19"/>
+              </w:rPr>
+              <w:t>0.00</w:t>
+            </w:r>
+          </w:p>
+        </w:tc>
+        <w:tc>
+          <w:tcPr>
+            <w:tcW w:type="dxa" w:w="2736"/>
+          </w:tcPr>
+          <w:p>
+            <w:r>
+              <w:rPr>
+                <w:sz w:val="19"/>
+              </w:rPr>
+              <w:t>0.03</w:t>
+            </w:r>
+          </w:p>
+        </w:tc>
+      </w:tr>
+      <w:tr>
+        <w:tc>
+          <w:tcPr>
+            <w:tcW w:type="dxa" w:w="4176"/>
+          </w:tcPr>
+          <w:p>
+            <w:r>
+              <w:rPr>
+                <w:sz w:val="19"/>
+              </w:rPr>
+              <w:t>Per-branch L1  (w_branch)</w:t>
+            </w:r>
+          </w:p>
+        </w:tc>
+        <w:tc>
+          <w:tcPr>
+            <w:tcW w:type="dxa" w:w="2448"/>
+          </w:tcPr>
+          <w:p>
+            <w:r>
+              <w:rPr>
+                <w:sz w:val="19"/>
+              </w:rPr>
+              <w:t>0.00</w:t>
+            </w:r>
+          </w:p>
+        </w:tc>
+        <w:tc>
+          <w:tcPr>
+            <w:tcW w:type="dxa" w:w="2736"/>
+          </w:tcPr>
+          <w:p>
+            <w:r>
+              <w:rPr>
+                <w:sz w:val="19"/>
+              </w:rPr>
+              <w:t>0.00 *</w:t>
+            </w:r>
+          </w:p>
+        </w:tc>
+      </w:tr>
+      <w:tr>
+        <w:tc>
+          <w:tcPr>
+            <w:tcW w:type="dxa" w:w="4176"/>
+          </w:tcPr>
+          <w:p>
+            <w:r>
+              <w:rPr>
+                <w:sz w:val="19"/>
+              </w:rPr>
+              <w:t>Gate balance (mean(w)-0.5)^2  (w_gate)</w:t>
+            </w:r>
+          </w:p>
+        </w:tc>
+        <w:tc>
+          <w:tcPr>
+            <w:tcW w:type="dxa" w:w="2448"/>
+          </w:tcPr>
+          <w:p>
+            <w:r>
+              <w:rPr>
+                <w:sz w:val="19"/>
+              </w:rPr>
+              <w:t>0.00</w:t>
+            </w:r>
+          </w:p>
+        </w:tc>
+        <w:tc>
+          <w:tcPr>
+            <w:tcW w:type="dxa" w:w="2736"/>
+          </w:tcPr>
+          <w:p>
+            <w:r>
+              <w:rPr>
+                <w:sz w:val="19"/>
+              </w:rPr>
+              <w:t>0.06</w:t>
+            </w:r>
+          </w:p>
+        </w:tc>
+      </w:tr>
+    </w:tbl>
+    <w:p/>
+    <w:p>
+      <w:r>
+        <w:rPr>
+          <w:b w:val="0"/>
+          <w:i w:val="0"/>
+          <w:color w:val="606060"/>
+          <w:sz w:val="18"/>
+        </w:rPr>
+        <w:t>* w_branch is implemented and available (--w-branch) but was set to 0 in the shipped fine-tune; resetting the gate plus the balance term was enough to bring both branches back to full strength.</w:t>
+      </w:r>
+    </w:p>
+    <w:p>
+      <w:pPr>
+        <w:pStyle w:val="Heading2"/>
+      </w:pPr>
+      <w:r>
+        <w:t>A.5  Run 1 -- base training  (checkpoints/drishti)</w:t>
+      </w:r>
+    </w:p>
+    <w:tbl>
+      <w:tblPr>
+        <w:tblStyle w:val="LightGrid-Accent1"/>
+        <w:tblW w:type="auto" w:w="0"/>
+        <w:jc w:val="center"/>
+        <w:tblLook w:firstColumn="1" w:firstRow="1" w:lastColumn="0" w:lastRow="0" w:noHBand="0" w:noVBand="1" w:val="04A0"/>
+      </w:tblPr>
+      <w:tblGrid>
+        <w:gridCol w:w="4320"/>
+        <w:gridCol w:w="4320"/>
+      </w:tblGrid>
+      <w:tr>
+        <w:tc>
+          <w:tcPr>
+            <w:tcW w:type="dxa" w:w="4176"/>
+          </w:tcPr>
+          <w:p>
+            <w:r>
+              <w:rPr>
+                <w:b/>
+              </w:rPr>
+              <w:t>Parameter</w:t>
+            </w:r>
+          </w:p>
+        </w:tc>
+        <w:tc>
+          <w:tcPr>
+            <w:tcW w:type="dxa" w:w="5184"/>
+          </w:tcPr>
+          <w:p>
+            <w:r>
+              <w:rPr>
+                <w:b/>
+              </w:rPr>
+              <w:t>Value</w:t>
+            </w:r>
+          </w:p>
+        </w:tc>
+      </w:tr>
+      <w:tr>
+        <w:tc>
+          <w:tcPr>
+            <w:tcW w:type="dxa" w:w="4176"/>
+          </w:tcPr>
+          <w:p>
+            <w:r>
+              <w:rPr>
+                <w:sz w:val="19"/>
+              </w:rPr>
+              <w:t>Steps requested / used</w:t>
+            </w:r>
+          </w:p>
+        </w:tc>
+        <w:tc>
+          <w:tcPr>
+            <w:tcW w:type="dxa" w:w="5184"/>
+          </w:tcPr>
+          <w:p>
+            <w:r>
+              <w:rPr>
+                <w:sz w:val="19"/>
+              </w:rPr>
+              <w:t>35,000 requested; stopped at ~13,500 when the held-out PSNR plateaued</w:t>
+            </w:r>
+          </w:p>
+        </w:tc>
+      </w:tr>
+      <w:tr>
+        <w:tc>
+          <w:tcPr>
+            <w:tcW w:type="dxa" w:w="4176"/>
+          </w:tcPr>
+          <w:p>
+            <w:r>
+              <w:rPr>
+                <w:sz w:val="19"/>
+              </w:rPr>
+              <w:t>Selected checkpoint</w:t>
+            </w:r>
+          </w:p>
+        </w:tc>
+        <w:tc>
+          <w:tcPr>
+            <w:tcW w:type="dxa" w:w="5184"/>
+          </w:tcPr>
+          <w:p>
+            <w:r>
+              <w:rPr>
+                <w:sz w:val="19"/>
+              </w:rPr>
+              <w:t>best.pt at step 13,500</w:t>
+            </w:r>
+          </w:p>
+        </w:tc>
+      </w:tr>
+      <w:tr>
+        <w:tc>
+          <w:tcPr>
+            <w:tcW w:type="dxa" w:w="4176"/>
+          </w:tcPr>
+          <w:p>
+            <w:r>
+              <w:rPr>
+                <w:sz w:val="19"/>
+              </w:rPr>
+              <w:t>Base learning rate</w:t>
+            </w:r>
+          </w:p>
+        </w:tc>
+        <w:tc>
+          <w:tcPr>
+            <w:tcW w:type="dxa" w:w="5184"/>
+          </w:tcPr>
+          <w:p>
+            <w:r>
+              <w:rPr>
+                <w:sz w:val="19"/>
+              </w:rPr>
+              <w:t>2e-4</w:t>
+            </w:r>
+          </w:p>
+        </w:tc>
+      </w:tr>
+      <w:tr>
+        <w:tc>
+          <w:tcPr>
+            <w:tcW w:type="dxa" w:w="4176"/>
+          </w:tcPr>
+          <w:p>
+            <w:r>
+              <w:rPr>
+                <w:sz w:val="19"/>
+              </w:rPr>
+              <w:t>Batch size</w:t>
+            </w:r>
+          </w:p>
+        </w:tc>
+        <w:tc>
+          <w:tcPr>
+            <w:tcW w:type="dxa" w:w="5184"/>
+          </w:tcPr>
+          <w:p>
+            <w:r>
+              <w:rPr>
+                <w:sz w:val="19"/>
+              </w:rPr>
+              <w:t>8</w:t>
+            </w:r>
+          </w:p>
+        </w:tc>
+      </w:tr>
+      <w:tr>
+        <w:tc>
+          <w:tcPr>
+            <w:tcW w:type="dxa" w:w="4176"/>
+          </w:tcPr>
+          <w:p>
+            <w:r>
+              <w:rPr>
+                <w:sz w:val="19"/>
+              </w:rPr>
+              <w:t>HR patch</w:t>
+            </w:r>
+          </w:p>
+        </w:tc>
+        <w:tc>
+          <w:tcPr>
+            <w:tcW w:type="dxa" w:w="5184"/>
+          </w:tcPr>
+          <w:p>
+            <w:r>
+              <w:rPr>
+                <w:sz w:val="19"/>
+              </w:rPr>
+              <w:t>256</w:t>
+            </w:r>
+          </w:p>
+        </w:tc>
+      </w:tr>
+      <w:tr>
+        <w:tc>
+          <w:tcPr>
+            <w:tcW w:type="dxa" w:w="4176"/>
+          </w:tcPr>
+          <w:p>
+            <w:r>
+              <w:rPr>
+                <w:sz w:val="19"/>
+              </w:rPr>
+              <w:t>Channels / CNN blocks / Swin depth / window</w:t>
+            </w:r>
+          </w:p>
+        </w:tc>
+        <w:tc>
+          <w:tcPr>
+            <w:tcW w:type="dxa" w:w="5184"/>
+          </w:tcPr>
+          <w:p>
+            <w:r>
+              <w:rPr>
+                <w:sz w:val="19"/>
+              </w:rPr>
+              <w:t>96 / 12 / 6 / 8</w:t>
+            </w:r>
+          </w:p>
+        </w:tc>
+      </w:tr>
+      <w:tr>
+        <w:tc>
+          <w:tcPr>
+            <w:tcW w:type="dxa" w:w="4176"/>
+          </w:tcPr>
+          <w:p>
+            <w:r>
+              <w:rPr>
+                <w:sz w:val="19"/>
+              </w:rPr>
+              <w:t>Dropout</w:t>
+            </w:r>
+          </w:p>
+        </w:tc>
+        <w:tc>
+          <w:tcPr>
+            <w:tcW w:type="dxa" w:w="5184"/>
+          </w:tcPr>
+          <w:p>
+            <w:r>
+              <w:rPr>
+                <w:sz w:val="19"/>
+              </w:rPr>
+              <w:t>0.1</w:t>
+            </w:r>
+          </w:p>
+        </w:tc>
+      </w:tr>
+      <w:tr>
+        <w:tc>
+          <w:tcPr>
+            <w:tcW w:type="dxa" w:w="4176"/>
+          </w:tcPr>
+          <w:p>
+            <w:r>
+              <w:rPr>
+                <w:sz w:val="19"/>
+              </w:rPr>
+              <w:t>Degrade sigma</w:t>
+            </w:r>
+          </w:p>
+        </w:tc>
+        <w:tc>
+          <w:tcPr>
+            <w:tcW w:type="dxa" w:w="5184"/>
+          </w:tcPr>
+          <w:p>
+            <w:r>
+              <w:rPr>
+                <w:sz w:val="19"/>
+              </w:rPr>
+              <w:t>0  (box filter)</w:t>
+            </w:r>
+          </w:p>
+        </w:tc>
+      </w:tr>
+      <w:tr>
+        <w:tc>
+          <w:tcPr>
+            <w:tcW w:type="dxa" w:w="4176"/>
+          </w:tcPr>
+          <w:p>
+            <w:r>
+              <w:rPr>
+                <w:sz w:val="19"/>
+              </w:rPr>
+              <w:t>Random seed</w:t>
+            </w:r>
+          </w:p>
+        </w:tc>
+        <w:tc>
+          <w:tcPr>
+            <w:tcW w:type="dxa" w:w="5184"/>
+          </w:tcPr>
+          <w:p>
+            <w:r>
+              <w:rPr>
+                <w:sz w:val="19"/>
+              </w:rPr>
+              <w:t>0</w:t>
+            </w:r>
+          </w:p>
+        </w:tc>
+      </w:tr>
+      <w:tr>
+        <w:tc>
+          <w:tcPr>
+            <w:tcW w:type="dxa" w:w="4176"/>
+          </w:tcPr>
+          <w:p>
+            <w:r>
+              <w:rPr>
+                <w:sz w:val="19"/>
+              </w:rPr>
+              <w:t>Wall-clock</w:t>
+            </w:r>
+          </w:p>
+        </w:tc>
+        <w:tc>
+          <w:tcPr>
+            <w:tcW w:type="dxa" w:w="5184"/>
+          </w:tcPr>
+          <w:p>
+            <w:r>
+              <w:rPr>
+                <w:sz w:val="19"/>
+              </w:rPr>
+              <w:t>~3.4 hours on the laptop GPU (MPS)</w:t>
+            </w:r>
+          </w:p>
+        </w:tc>
+      </w:tr>
+    </w:tbl>
+    <w:p/>
+    <w:p>
+      <w:r>
+        <w:rPr>
+          <w:b w:val="0"/>
+          <w:i w:val="0"/>
+          <w:color w:val="606060"/>
+          <w:sz w:val="16"/>
+        </w:rPr>
+        <w:t>python scripts/train.py --train &lt;12 scenes&gt; --holdout data/raw/vasai_s2l2a.tif --sigma 0 --steps 35000 --batch 8 --hr-patch 256 --lr 2e-4 --ch 96 --cnn-blocks 12 --swin-depth 6 --window 8 --dropout 0.1 --w-sam 0.15 --w-cons 0.5 --val-every 500 --val-size 512 --seed 0 --out checkpoints/drishti</w:t>
+      </w:r>
+    </w:p>
+    <w:p>
+      <w:pPr>
+        <w:pStyle w:val="Heading2"/>
+      </w:pPr>
+      <w:r>
+        <w:t>A.6  Run 2 -- fine-tune to rebalance the branches  (checkpoints/drishti-ft)</w:t>
+      </w:r>
+    </w:p>
+    <w:tbl>
+      <w:tblPr>
+        <w:tblStyle w:val="LightGrid-Accent1"/>
+        <w:tblW w:type="auto" w:w="0"/>
+        <w:jc w:val="center"/>
+        <w:tblLook w:firstColumn="1" w:firstRow="1" w:lastColumn="0" w:lastRow="0" w:noHBand="0" w:noVBand="1" w:val="04A0"/>
+      </w:tblPr>
+      <w:tblGrid>
+        <w:gridCol w:w="4320"/>
+        <w:gridCol w:w="4320"/>
+      </w:tblGrid>
+      <w:tr>
+        <w:tc>
+          <w:tcPr>
+            <w:tcW w:type="dxa" w:w="4176"/>
+          </w:tcPr>
+          <w:p>
+            <w:r>
+              <w:rPr>
+                <w:b/>
+              </w:rPr>
+              <w:t>Parameter</w:t>
+            </w:r>
+          </w:p>
+        </w:tc>
+        <w:tc>
+          <w:tcPr>
+            <w:tcW w:type="dxa" w:w="5184"/>
+          </w:tcPr>
+          <w:p>
+            <w:r>
+              <w:rPr>
+                <w:b/>
+              </w:rPr>
+              <w:t>Value</w:t>
+            </w:r>
+          </w:p>
+        </w:tc>
+      </w:tr>
+      <w:tr>
+        <w:tc>
+          <w:tcPr>
+            <w:tcW w:type="dxa" w:w="4176"/>
+          </w:tcPr>
+          <w:p>
+            <w:r>
+              <w:rPr>
+                <w:sz w:val="19"/>
+              </w:rPr>
+              <w:t>Starts from</w:t>
+            </w:r>
+          </w:p>
+        </w:tc>
+        <w:tc>
+          <w:tcPr>
+            <w:tcW w:type="dxa" w:w="5184"/>
+          </w:tcPr>
+          <w:p>
+            <w:r>
+              <w:rPr>
+                <w:sz w:val="19"/>
+              </w:rPr>
+              <w:t>checkpoints/drishti/best.pt  (weights only, fresh optimiser and schedule)</w:t>
+            </w:r>
+          </w:p>
+        </w:tc>
+      </w:tr>
+      <w:tr>
+        <w:tc>
+          <w:tcPr>
+            <w:tcW w:type="dxa" w:w="4176"/>
+          </w:tcPr>
+          <w:p>
+            <w:r>
+              <w:rPr>
+                <w:sz w:val="19"/>
+              </w:rPr>
+              <w:t>Gate</w:t>
+            </w:r>
+          </w:p>
+        </w:tc>
+        <w:tc>
+          <w:tcPr>
+            <w:tcW w:type="dxa" w:w="5184"/>
+          </w:tcPr>
+          <w:p>
+            <w:r>
+              <w:rPr>
+                <w:sz w:val="19"/>
+              </w:rPr>
+              <w:t>reset to zero  (--reset-gate)  so w starts at exactly 0.5 everywhere</w:t>
+            </w:r>
+          </w:p>
+        </w:tc>
+      </w:tr>
+      <w:tr>
+        <w:tc>
+          <w:tcPr>
+            <w:tcW w:type="dxa" w:w="4176"/>
+          </w:tcPr>
+          <w:p>
+            <w:r>
+              <w:rPr>
+                <w:sz w:val="19"/>
+              </w:rPr>
+              <w:t>Steps requested / used</w:t>
+            </w:r>
+          </w:p>
+        </w:tc>
+        <w:tc>
+          <w:tcPr>
+            <w:tcW w:type="dxa" w:w="5184"/>
+          </w:tcPr>
+          <w:p>
+            <w:r>
+              <w:rPr>
+                <w:sz w:val="19"/>
+              </w:rPr>
+              <w:t>3,000 requested; stopped at ~1,600 (validation flat)</w:t>
+            </w:r>
+          </w:p>
+        </w:tc>
+      </w:tr>
+      <w:tr>
+        <w:tc>
+          <w:tcPr>
+            <w:tcW w:type="dxa" w:w="4176"/>
+          </w:tcPr>
+          <w:p>
+            <w:r>
+              <w:rPr>
+                <w:sz w:val="19"/>
+              </w:rPr>
+              <w:t>Selected checkpoint</w:t>
+            </w:r>
+          </w:p>
+        </w:tc>
+        <w:tc>
+          <w:tcPr>
+            <w:tcW w:type="dxa" w:w="5184"/>
+          </w:tcPr>
+          <w:p>
+            <w:r>
+              <w:rPr>
+                <w:sz w:val="19"/>
+              </w:rPr>
+              <w:t>best.pt at step 1,250</w:t>
+            </w:r>
+          </w:p>
+        </w:tc>
+      </w:tr>
+      <w:tr>
+        <w:tc>
+          <w:tcPr>
+            <w:tcW w:type="dxa" w:w="4176"/>
+          </w:tcPr>
+          <w:p>
+            <w:r>
+              <w:rPr>
+                <w:sz w:val="19"/>
+              </w:rPr>
+              <w:t>Base learning rate</w:t>
+            </w:r>
+          </w:p>
+        </w:tc>
+        <w:tc>
+          <w:tcPr>
+            <w:tcW w:type="dxa" w:w="5184"/>
+          </w:tcPr>
+          <w:p>
+            <w:r>
+              <w:rPr>
+                <w:sz w:val="19"/>
+              </w:rPr>
+              <w:t>1.2e-4  (fresh cosine schedule, T_max 3,000)</w:t>
+            </w:r>
+          </w:p>
+        </w:tc>
+      </w:tr>
+      <w:tr>
+        <w:tc>
+          <w:tcPr>
+            <w:tcW w:type="dxa" w:w="4176"/>
+          </w:tcPr>
+          <w:p>
+            <w:r>
+              <w:rPr>
+                <w:sz w:val="19"/>
+              </w:rPr>
+              <w:t>Added losses</w:t>
+            </w:r>
+          </w:p>
+        </w:tc>
+        <w:tc>
+          <w:tcPr>
+            <w:tcW w:type="dxa" w:w="5184"/>
+          </w:tcPr>
+          <w:p>
+            <w:r>
+              <w:rPr>
+                <w:sz w:val="19"/>
+              </w:rPr>
+              <w:t>w_grad 0.03,  w_gate 0.06</w:t>
+            </w:r>
+          </w:p>
+        </w:tc>
+      </w:tr>
+      <w:tr>
+        <w:tc>
+          <w:tcPr>
+            <w:tcW w:type="dxa" w:w="4176"/>
+          </w:tcPr>
+          <w:p>
+            <w:r>
+              <w:rPr>
+                <w:sz w:val="19"/>
+              </w:rPr>
+              <w:t>Batch / patch / architecture</w:t>
+            </w:r>
+          </w:p>
+        </w:tc>
+        <w:tc>
+          <w:tcPr>
+            <w:tcW w:type="dxa" w:w="5184"/>
+          </w:tcPr>
+          <w:p>
+            <w:r>
+              <w:rPr>
+                <w:sz w:val="19"/>
+              </w:rPr>
+              <w:t>unchanged from Run 1 (8 / 256 / 96-12-6-8 / dropout 0.1)</w:t>
+            </w:r>
+          </w:p>
+        </w:tc>
+      </w:tr>
+      <w:tr>
+        <w:tc>
+          <w:tcPr>
+            <w:tcW w:type="dxa" w:w="4176"/>
+          </w:tcPr>
+          <w:p>
+            <w:r>
+              <w:rPr>
+                <w:sz w:val="19"/>
+              </w:rPr>
+              <w:t>Degrade sigma</w:t>
+            </w:r>
+          </w:p>
+        </w:tc>
+        <w:tc>
+          <w:tcPr>
+            <w:tcW w:type="dxa" w:w="5184"/>
+          </w:tcPr>
+          <w:p>
+            <w:r>
+              <w:rPr>
+                <w:sz w:val="19"/>
+              </w:rPr>
+              <w:t>0</w:t>
+            </w:r>
+          </w:p>
+        </w:tc>
+      </w:tr>
+      <w:tr>
+        <w:tc>
+          <w:tcPr>
+            <w:tcW w:type="dxa" w:w="4176"/>
+          </w:tcPr>
+          <w:p>
+            <w:r>
+              <w:rPr>
+                <w:sz w:val="19"/>
+              </w:rPr>
+              <w:t>Random seed</w:t>
+            </w:r>
+          </w:p>
+        </w:tc>
+        <w:tc>
+          <w:tcPr>
+            <w:tcW w:type="dxa" w:w="5184"/>
+          </w:tcPr>
+          <w:p>
+            <w:r>
+              <w:rPr>
+                <w:sz w:val="19"/>
+              </w:rPr>
+              <w:t>1</w:t>
+            </w:r>
+          </w:p>
+        </w:tc>
+      </w:tr>
+      <w:tr>
+        <w:tc>
+          <w:tcPr>
+            <w:tcW w:type="dxa" w:w="4176"/>
+          </w:tcPr>
+          <w:p>
+            <w:r>
+              <w:rPr>
+                <w:sz w:val="19"/>
+              </w:rPr>
+              <w:t>Wall-clock</w:t>
+            </w:r>
+          </w:p>
+        </w:tc>
+        <w:tc>
+          <w:tcPr>
+            <w:tcW w:type="dxa" w:w="5184"/>
+          </w:tcPr>
+          <w:p>
+            <w:r>
+              <w:rPr>
+                <w:sz w:val="19"/>
+              </w:rPr>
+              <w:t>~30 minutes on the laptop GPU</w:t>
+            </w:r>
+          </w:p>
+        </w:tc>
+      </w:tr>
+    </w:tbl>
+    <w:p/>
+    <w:p>
+      <w:r>
+        <w:rPr>
+          <w:b w:val="0"/>
+          <w:i w:val="0"/>
+          <w:color w:val="606060"/>
+          <w:sz w:val="16"/>
+        </w:rPr>
+        <w:t>python scripts/train.py --train &lt;12 scenes&gt; --holdout data/raw/vasai_s2l2a.tif --sigma 0 --init-from checkpoints/drishti/best.pt --reset-gate --steps 3000 --batch 8 --hr-patch 256 --lr 1.2e-4 --ch 96 --cnn-blocks 12 --swin-depth 6 --window 8 --dropout 0.1 --w-sam 0.15 --w-cons 0.5 --w-gate 0.06 --w-grad 0.03 --val-every 250 --val-size 512 --seed 1 --out checkpoints/drishti-ft</w:t>
+      </w:r>
+    </w:p>
+    <w:p>
+      <w:pPr>
+        <w:pStyle w:val="Heading2"/>
+      </w:pPr>
+      <w:r>
+        <w:t>A.7  Inference settings</w:t>
+      </w:r>
+    </w:p>
+    <w:tbl>
+      <w:tblPr>
+        <w:tblStyle w:val="LightGrid-Accent1"/>
+        <w:tblW w:type="auto" w:w="0"/>
+        <w:jc w:val="center"/>
+        <w:tblLook w:firstColumn="1" w:firstRow="1" w:lastColumn="0" w:lastRow="0" w:noHBand="0" w:noVBand="1" w:val="04A0"/>
+      </w:tblPr>
+      <w:tblGrid>
+        <w:gridCol w:w="4320"/>
+        <w:gridCol w:w="4320"/>
+      </w:tblGrid>
+      <w:tr>
+        <w:tc>
+          <w:tcPr>
+            <w:tcW w:type="dxa" w:w="3744"/>
+          </w:tcPr>
+          <w:p>
+            <w:r>
+              <w:rPr>
+                <w:b/>
+              </w:rPr>
+              <w:t>Parameter</w:t>
+            </w:r>
+          </w:p>
+        </w:tc>
+        <w:tc>
+          <w:tcPr>
+            <w:tcW w:type="dxa" w:w="5616"/>
+          </w:tcPr>
+          <w:p>
+            <w:r>
+              <w:rPr>
+                <w:b/>
+              </w:rPr>
+              <w:t>Value</w:t>
+            </w:r>
+          </w:p>
+        </w:tc>
+      </w:tr>
+      <w:tr>
+        <w:tc>
+          <w:tcPr>
+            <w:tcW w:type="dxa" w:w="3744"/>
+          </w:tcPr>
+          <w:p>
+            <w:r>
+              <w:rPr>
+                <w:sz w:val="19"/>
+              </w:rPr>
+              <w:t>Tile size / overlap</w:t>
+            </w:r>
+          </w:p>
+        </w:tc>
+        <w:tc>
+          <w:tcPr>
+            <w:tcW w:type="dxa" w:w="5616"/>
+          </w:tcPr>
+          <w:p>
+            <w:r>
+              <w:rPr>
+                <w:sz w:val="19"/>
+              </w:rPr>
+              <w:t>128 px LR  -&gt;  512 px SR, 16 px LR overlap</w:t>
+            </w:r>
+          </w:p>
+        </w:tc>
+      </w:tr>
+      <w:tr>
+        <w:tc>
+          <w:tcPr>
+            <w:tcW w:type="dxa" w:w="3744"/>
+          </w:tcPr>
+          <w:p>
+            <w:r>
+              <w:rPr>
+                <w:sz w:val="19"/>
+              </w:rPr>
+              <w:t>Stitching</w:t>
+            </w:r>
+          </w:p>
+        </w:tc>
+        <w:tc>
+          <w:tcPr>
+            <w:tcW w:type="dxa" w:w="5616"/>
+          </w:tcPr>
+          <w:p>
+            <w:r>
+              <w:rPr>
+                <w:sz w:val="19"/>
+              </w:rPr>
+              <w:t>feather (linear ramp) blend over the overlap</w:t>
+            </w:r>
+          </w:p>
+        </w:tc>
+      </w:tr>
+      <w:tr>
+        <w:tc>
+          <w:tcPr>
+            <w:tcW w:type="dxa" w:w="3744"/>
+          </w:tcPr>
+          <w:p>
+            <w:r>
+              <w:rPr>
+                <w:sz w:val="19"/>
+              </w:rPr>
+              <w:t>MC-dropout passes (confidence map)</w:t>
+            </w:r>
+          </w:p>
+        </w:tc>
+        <w:tc>
+          <w:tcPr>
+            <w:tcW w:type="dxa" w:w="5616"/>
+          </w:tcPr>
+          <w:p>
+            <w:r>
+              <w:rPr>
+                <w:sz w:val="19"/>
+              </w:rPr>
+              <w:t>16</w:t>
+            </w:r>
+          </w:p>
+        </w:tc>
+      </w:tr>
+      <w:tr>
+        <w:tc>
+          <w:tcPr>
+            <w:tcW w:type="dxa" w:w="3744"/>
+          </w:tcPr>
+          <w:p>
+            <w:r>
+              <w:rPr>
+                <w:sz w:val="19"/>
+              </w:rPr>
+              <w:t>Per-tile quality check</w:t>
+            </w:r>
+          </w:p>
+        </w:tc>
+        <w:tc>
+          <w:tcPr>
+            <w:tcW w:type="dxa" w:w="5616"/>
+          </w:tcPr>
+          <w:p>
+            <w:r>
+              <w:rPr>
+                <w:sz w:val="19"/>
+              </w:rPr>
+              <w:t>shrink-consistency RMSE, spectral angle, and 95th-percentile confidence, checked before stitching</w:t>
+            </w:r>
+          </w:p>
+        </w:tc>
+      </w:tr>
+      <w:tr>
+        <w:tc>
+          <w:tcPr>
+            <w:tcW w:type="dxa" w:w="3744"/>
+          </w:tcPr>
+          <w:p>
+            <w:r>
+              <w:rPr>
+                <w:sz w:val="19"/>
+              </w:rPr>
+              <w:t>Output</w:t>
+            </w:r>
+          </w:p>
+        </w:tc>
+        <w:tc>
+          <w:tcPr>
+            <w:tcW w:type="dxa" w:w="5616"/>
+          </w:tcPr>
+          <w:p>
+            <w:r>
+              <w:rPr>
+                <w:sz w:val="19"/>
+              </w:rPr>
+              <w:t>4-band uint16 COG, DN = reflectance x 10000, plus _confidence / _divergence / _qa_mask rasters</w:t>
+            </w:r>
+          </w:p>
+        </w:tc>
+      </w:tr>
+    </w:tbl>
+    <w:p/>
     <w:p>
       <w:pPr>
         <w:pStyle w:val="Heading1"/>

</xml_diff>

<commit_message>
docx: explain every training-log column (train_log.csv), with example rows
</commit_message>
<xml_diff>
--- a/docs/DRISHTI_project_explainer.docx
+++ b/docs/DRISHTI_project_explainer.docx
@@ -5720,6 +5720,759 @@
       </w:tr>
     </w:tbl>
     <w:p/>
+    <w:p>
+      <w:pPr>
+        <w:pStyle w:val="Heading2"/>
+      </w:pPr>
+      <w:r>
+        <w:t>A.8  Reading the training log  (checkpoints/&lt;run&gt;/train_log.csv)</w:t>
+      </w:r>
+    </w:p>
+    <w:p>
+      <w:r>
+        <w:rPr>
+          <w:b w:val="0"/>
+          <w:i w:val="0"/>
+        </w:rPr>
+        <w:t>One row is written at every validation step. The columns:</w:t>
+      </w:r>
+    </w:p>
+    <w:tbl>
+      <w:tblPr>
+        <w:tblStyle w:val="LightGrid-Accent1"/>
+        <w:tblW w:type="auto" w:w="0"/>
+        <w:jc w:val="center"/>
+        <w:tblLook w:firstColumn="1" w:firstRow="1" w:lastColumn="0" w:lastRow="0" w:noHBand="0" w:noVBand="1" w:val="04A0"/>
+      </w:tblPr>
+      <w:tblGrid>
+        <w:gridCol w:w="4320"/>
+        <w:gridCol w:w="4320"/>
+      </w:tblGrid>
+      <w:tr>
+        <w:tc>
+          <w:tcPr>
+            <w:tcW w:type="dxa" w:w="2016"/>
+          </w:tcPr>
+          <w:p>
+            <w:r>
+              <w:rPr>
+                <w:b/>
+              </w:rPr>
+              <w:t>Column</w:t>
+            </w:r>
+          </w:p>
+        </w:tc>
+        <w:tc>
+          <w:tcPr>
+            <w:tcW w:type="dxa" w:w="7344"/>
+          </w:tcPr>
+          <w:p>
+            <w:r>
+              <w:rPr>
+                <w:b/>
+              </w:rPr>
+              <w:t>What it means</w:t>
+            </w:r>
+          </w:p>
+        </w:tc>
+      </w:tr>
+      <w:tr>
+        <w:tc>
+          <w:tcPr>
+            <w:tcW w:type="dxa" w:w="2016"/>
+          </w:tcPr>
+          <w:p>
+            <w:r>
+              <w:rPr>
+                <w:sz w:val="19"/>
+              </w:rPr>
+              <w:t>step</w:t>
+            </w:r>
+          </w:p>
+        </w:tc>
+        <w:tc>
+          <w:tcPr>
+            <w:tcW w:type="dxa" w:w="7344"/>
+          </w:tcPr>
+          <w:p>
+            <w:r>
+              <w:rPr>
+                <w:sz w:val="19"/>
+              </w:rPr>
+              <w:t>which training iteration (batch number) this row is for.</w:t>
+            </w:r>
+          </w:p>
+        </w:tc>
+      </w:tr>
+      <w:tr>
+        <w:tc>
+          <w:tcPr>
+            <w:tcW w:type="dxa" w:w="2016"/>
+          </w:tcPr>
+          <w:p>
+            <w:r>
+              <w:rPr>
+                <w:sz w:val="19"/>
+              </w:rPr>
+              <w:t>lr</w:t>
+            </w:r>
+          </w:p>
+        </w:tc>
+        <w:tc>
+          <w:tcPr>
+            <w:tcW w:type="dxa" w:w="7344"/>
+          </w:tcPr>
+          <w:p>
+            <w:r>
+              <w:rPr>
+                <w:sz w:val="19"/>
+              </w:rPr>
+              <w:t>the learning rate in use at that step. It starts at the base rate and follows a cosine curve down to 5% of it by the end.</w:t>
+            </w:r>
+          </w:p>
+        </w:tc>
+      </w:tr>
+      <w:tr>
+        <w:tc>
+          <w:tcPr>
+            <w:tcW w:type="dxa" w:w="2016"/>
+          </w:tcPr>
+          <w:p>
+            <w:r>
+              <w:rPr>
+                <w:sz w:val="19"/>
+              </w:rPr>
+              <w:t>loss</w:t>
+            </w:r>
+          </w:p>
+        </w:tc>
+        <w:tc>
+          <w:tcPr>
+            <w:tcW w:type="dxa" w:w="7344"/>
+          </w:tcPr>
+          <w:p>
+            <w:r>
+              <w:rPr>
+                <w:sz w:val="19"/>
+              </w:rPr>
+              <w:t>the total training loss on the most recent batches -- the single number the optimiser is minimising. It is the weighted sum of the terms below (weights in A.4).</w:t>
+            </w:r>
+          </w:p>
+        </w:tc>
+      </w:tr>
+      <w:tr>
+        <w:tc>
+          <w:tcPr>
+            <w:tcW w:type="dxa" w:w="2016"/>
+          </w:tcPr>
+          <w:p>
+            <w:r>
+              <w:rPr>
+                <w:sz w:val="19"/>
+              </w:rPr>
+              <w:t>l1</w:t>
+            </w:r>
+          </w:p>
+        </w:tc>
+        <w:tc>
+          <w:tcPr>
+            <w:tcW w:type="dxa" w:w="7344"/>
+          </w:tcPr>
+          <w:p>
+            <w:r>
+              <w:rPr>
+                <w:sz w:val="19"/>
+              </w:rPr>
+              <w:t>average absolute pixel error between the model output and the true image, in reflectance units (~0..1). The main 'is each pixel the right brightness' term. Lower is better.</w:t>
+            </w:r>
+          </w:p>
+        </w:tc>
+      </w:tr>
+      <w:tr>
+        <w:tc>
+          <w:tcPr>
+            <w:tcW w:type="dxa" w:w="2016"/>
+          </w:tcPr>
+          <w:p>
+            <w:r>
+              <w:rPr>
+                <w:sz w:val="19"/>
+              </w:rPr>
+              <w:t>sam_rad</w:t>
+            </w:r>
+          </w:p>
+        </w:tc>
+        <w:tc>
+          <w:tcPr>
+            <w:tcW w:type="dxa" w:w="7344"/>
+          </w:tcPr>
+          <w:p>
+            <w:r>
+              <w:rPr>
+                <w:sz w:val="19"/>
+              </w:rPr>
+              <w:t>Spectral Angle Mapper error, in radians. How far each pixel's colour signature (its mix across the 4 bands) has been rotated away from the truth, ignoring overall brightness. This is the term that protects NDVI / NDWI. Lower is better.</w:t>
+            </w:r>
+          </w:p>
+        </w:tc>
+      </w:tr>
+      <w:tr>
+        <w:tc>
+          <w:tcPr>
+            <w:tcW w:type="dxa" w:w="2016"/>
+          </w:tcPr>
+          <w:p>
+            <w:r>
+              <w:rPr>
+                <w:sz w:val="19"/>
+              </w:rPr>
+              <w:t>cons</w:t>
+            </w:r>
+          </w:p>
+        </w:tc>
+        <w:tc>
+          <w:tcPr>
+            <w:tcW w:type="dxa" w:w="7344"/>
+          </w:tcPr>
+          <w:p>
+            <w:r>
+              <w:rPr>
+                <w:sz w:val="19"/>
+              </w:rPr>
+              <w:t>downsample-consistency error: shrink the output back to the low-res grid and compare to the input. It is ~0.000000 every row because the hard low-frequency rule makes it exact -- it is logged only so a regression would show up instantly.</w:t>
+            </w:r>
+          </w:p>
+        </w:tc>
+      </w:tr>
+      <w:tr>
+        <w:tc>
+          <w:tcPr>
+            <w:tcW w:type="dxa" w:w="2016"/>
+          </w:tcPr>
+          <w:p>
+            <w:r>
+              <w:rPr>
+                <w:sz w:val="19"/>
+              </w:rPr>
+              <w:t>val_psnr_db</w:t>
+            </w:r>
+          </w:p>
+        </w:tc>
+        <w:tc>
+          <w:tcPr>
+            <w:tcW w:type="dxa" w:w="7344"/>
+          </w:tcPr>
+          <w:p>
+            <w:r>
+              <w:rPr>
+                <w:sz w:val="19"/>
+              </w:rPr>
+              <w:t>PSNR on a fixed centre crop of the HELD-OUT scene (Vasai), in decibels. Reconstruction fidelity against the real pixels; +3 dB means the error was halved. Higher is better. This is the number best.pt is selected on.</w:t>
+            </w:r>
+          </w:p>
+        </w:tc>
+      </w:tr>
+      <w:tr>
+        <w:tc>
+          <w:tcPr>
+            <w:tcW w:type="dxa" w:w="2016"/>
+          </w:tcPr>
+          <w:p>
+            <w:r>
+              <w:rPr>
+                <w:sz w:val="19"/>
+              </w:rPr>
+              <w:t>val_ssim</w:t>
+            </w:r>
+          </w:p>
+        </w:tc>
+        <w:tc>
+          <w:tcPr>
+            <w:tcW w:type="dxa" w:w="7344"/>
+          </w:tcPr>
+          <w:p>
+            <w:r>
+              <w:rPr>
+                <w:sz w:val="19"/>
+              </w:rPr>
+              <w:t>structural similarity on the same held-out crop, 0 to 1. How well edges, textures and local contrast match the truth, rather than raw pixel error. Higher is better.</w:t>
+            </w:r>
+          </w:p>
+        </w:tc>
+      </w:tr>
+      <w:tr>
+        <w:tc>
+          <w:tcPr>
+            <w:tcW w:type="dxa" w:w="2016"/>
+          </w:tcPr>
+          <w:p>
+            <w:r>
+              <w:rPr>
+                <w:sz w:val="19"/>
+              </w:rPr>
+              <w:t>val_sam_deg</w:t>
+            </w:r>
+          </w:p>
+        </w:tc>
+        <w:tc>
+          <w:tcPr>
+            <w:tcW w:type="dxa" w:w="7344"/>
+          </w:tcPr>
+          <w:p>
+            <w:r>
+              <w:rPr>
+                <w:sz w:val="19"/>
+              </w:rPr>
+              <w:t>the same spectral-angle error as sam_rad but measured on the held-out crop and converted to degrees. Colour / spectral-index fidelity on unseen data. Lower is better.</w:t>
+            </w:r>
+          </w:p>
+        </w:tc>
+      </w:tr>
+      <w:tr>
+        <w:tc>
+          <w:tcPr>
+            <w:tcW w:type="dxa" w:w="2016"/>
+          </w:tcPr>
+          <w:p>
+            <w:r>
+              <w:rPr>
+                <w:sz w:val="19"/>
+              </w:rPr>
+              <w:t>val_ndvi_mae</w:t>
+            </w:r>
+          </w:p>
+        </w:tc>
+        <w:tc>
+          <w:tcPr>
+            <w:tcW w:type="dxa" w:w="7344"/>
+          </w:tcPr>
+          <w:p>
+            <w:r>
+              <w:rPr>
+                <w:sz w:val="19"/>
+              </w:rPr>
+              <w:t>mean absolute error of NDVI (the vegetation index) computed on the output versus computed on the true image, on the held-out crop. Directly answers 'does the vegetation index survive super-resolution'. Lower is better.</w:t>
+            </w:r>
+          </w:p>
+        </w:tc>
+      </w:tr>
+      <w:tr>
+        <w:tc>
+          <w:tcPr>
+            <w:tcW w:type="dxa" w:w="2016"/>
+          </w:tcPr>
+          <w:p>
+            <w:r>
+              <w:rPr>
+                <w:sz w:val="19"/>
+              </w:rPr>
+              <w:t>bicubic_psnr_db</w:t>
+            </w:r>
+          </w:p>
+        </w:tc>
+        <w:tc>
+          <w:tcPr>
+            <w:tcW w:type="dxa" w:w="7344"/>
+          </w:tcPr>
+          <w:p>
+            <w:r>
+              <w:rPr>
+                <w:sz w:val="19"/>
+              </w:rPr>
+              <w:t>PSNR of plain bicubic upscaling on the exact same held-out crop -- the baseline. It is constant (34.27 dB) because the crop does not change. val_psnr_db minus this is 'how many dB better than just enlarging'.</w:t>
+            </w:r>
+          </w:p>
+        </w:tc>
+      </w:tr>
+      <w:tr>
+        <w:tc>
+          <w:tcPr>
+            <w:tcW w:type="dxa" w:w="2016"/>
+          </w:tcPr>
+          <w:p>
+            <w:r>
+              <w:rPr>
+                <w:sz w:val="19"/>
+              </w:rPr>
+              <w:t>secs</w:t>
+            </w:r>
+          </w:p>
+        </w:tc>
+        <w:tc>
+          <w:tcPr>
+            <w:tcW w:type="dxa" w:w="7344"/>
+          </w:tcPr>
+          <w:p>
+            <w:r>
+              <w:rPr>
+                <w:sz w:val="19"/>
+              </w:rPr>
+              <w:t>wall-clock seconds since training started -- used to track speed and estimate finishing time.</w:t>
+            </w:r>
+          </w:p>
+        </w:tc>
+      </w:tr>
+    </w:tbl>
+    <w:p/>
+    <w:p>
+      <w:r>
+        <w:rPr>
+          <w:b w:val="0"/>
+          <w:i w:val="0"/>
+          <w:color w:val="606060"/>
+          <w:sz w:val="18"/>
+        </w:rPr>
+        <w:t>Example rows from the base run:</w:t>
+      </w:r>
+    </w:p>
+    <w:tbl>
+      <w:tblPr>
+        <w:tblStyle w:val="LightGrid-Accent1"/>
+        <w:tblW w:type="auto" w:w="0"/>
+        <w:jc w:val="center"/>
+        <w:tblLook w:firstColumn="1" w:firstRow="1" w:lastColumn="0" w:lastRow="0" w:noHBand="0" w:noVBand="1" w:val="04A0"/>
+      </w:tblPr>
+      <w:tblGrid>
+        <w:gridCol w:w="1440"/>
+        <w:gridCol w:w="1440"/>
+        <w:gridCol w:w="1440"/>
+        <w:gridCol w:w="1440"/>
+        <w:gridCol w:w="1440"/>
+        <w:gridCol w:w="1440"/>
+      </w:tblGrid>
+      <w:tr>
+        <w:tc>
+          <w:tcPr>
+            <w:tcW w:type="dxa" w:w="1296"/>
+          </w:tcPr>
+          <w:p>
+            <w:r>
+              <w:rPr>
+                <w:b/>
+              </w:rPr>
+              <w:t>step</w:t>
+            </w:r>
+          </w:p>
+        </w:tc>
+        <w:tc>
+          <w:tcPr>
+            <w:tcW w:type="dxa" w:w="1584"/>
+          </w:tcPr>
+          <w:p>
+            <w:r>
+              <w:rPr>
+                <w:b/>
+              </w:rPr>
+              <w:t>val PSNR</w:t>
+            </w:r>
+          </w:p>
+        </w:tc>
+        <w:tc>
+          <w:tcPr>
+            <w:tcW w:type="dxa" w:w="1584"/>
+          </w:tcPr>
+          <w:p>
+            <w:r>
+              <w:rPr>
+                <w:b/>
+              </w:rPr>
+              <w:t>val SSIM</w:t>
+            </w:r>
+          </w:p>
+        </w:tc>
+        <w:tc>
+          <w:tcPr>
+            <w:tcW w:type="dxa" w:w="1584"/>
+          </w:tcPr>
+          <w:p>
+            <w:r>
+              <w:rPr>
+                <w:b/>
+              </w:rPr>
+              <w:t>val SAM deg</w:t>
+            </w:r>
+          </w:p>
+        </w:tc>
+        <w:tc>
+          <w:tcPr>
+            <w:tcW w:type="dxa" w:w="1728"/>
+          </w:tcPr>
+          <w:p>
+            <w:r>
+              <w:rPr>
+                <w:b/>
+              </w:rPr>
+              <w:t>val NDVI MAE</w:t>
+            </w:r>
+          </w:p>
+        </w:tc>
+        <w:tc>
+          <w:tcPr>
+            <w:tcW w:type="dxa" w:w="1584"/>
+          </w:tcPr>
+          <w:p>
+            <w:r>
+              <w:rPr>
+                <w:b/>
+              </w:rPr>
+              <w:t>bicubic PSNR</w:t>
+            </w:r>
+          </w:p>
+        </w:tc>
+      </w:tr>
+      <w:tr>
+        <w:tc>
+          <w:tcPr>
+            <w:tcW w:type="dxa" w:w="1296"/>
+          </w:tcPr>
+          <w:p>
+            <w:r>
+              <w:rPr>
+                <w:sz w:val="19"/>
+              </w:rPr>
+              <w:t>500</w:t>
+            </w:r>
+          </w:p>
+        </w:tc>
+        <w:tc>
+          <w:tcPr>
+            <w:tcW w:type="dxa" w:w="1584"/>
+          </w:tcPr>
+          <w:p>
+            <w:r>
+              <w:rPr>
+                <w:sz w:val="19"/>
+              </w:rPr>
+              <w:t>35.10</w:t>
+            </w:r>
+          </w:p>
+        </w:tc>
+        <w:tc>
+          <w:tcPr>
+            <w:tcW w:type="dxa" w:w="1584"/>
+          </w:tcPr>
+          <w:p>
+            <w:r>
+              <w:rPr>
+                <w:sz w:val="19"/>
+              </w:rPr>
+              <w:t>0.880</w:t>
+            </w:r>
+          </w:p>
+        </w:tc>
+        <w:tc>
+          <w:tcPr>
+            <w:tcW w:type="dxa" w:w="1584"/>
+          </w:tcPr>
+          <w:p>
+            <w:r>
+              <w:rPr>
+                <w:sz w:val="19"/>
+              </w:rPr>
+              <w:t>2.89</w:t>
+            </w:r>
+          </w:p>
+        </w:tc>
+        <w:tc>
+          <w:tcPr>
+            <w:tcW w:type="dxa" w:w="1728"/>
+          </w:tcPr>
+          <w:p>
+            <w:r>
+              <w:rPr>
+                <w:sz w:val="19"/>
+              </w:rPr>
+              <w:t>0.0460</w:t>
+            </w:r>
+          </w:p>
+        </w:tc>
+        <w:tc>
+          <w:tcPr>
+            <w:tcW w:type="dxa" w:w="1584"/>
+          </w:tcPr>
+          <w:p>
+            <w:r>
+              <w:rPr>
+                <w:sz w:val="19"/>
+              </w:rPr>
+              <w:t>34.27</w:t>
+            </w:r>
+          </w:p>
+        </w:tc>
+      </w:tr>
+      <w:tr>
+        <w:tc>
+          <w:tcPr>
+            <w:tcW w:type="dxa" w:w="1296"/>
+          </w:tcPr>
+          <w:p>
+            <w:r>
+              <w:rPr>
+                <w:sz w:val="19"/>
+              </w:rPr>
+              <w:t>7,000</w:t>
+            </w:r>
+          </w:p>
+        </w:tc>
+        <w:tc>
+          <w:tcPr>
+            <w:tcW w:type="dxa" w:w="1584"/>
+          </w:tcPr>
+          <w:p>
+            <w:r>
+              <w:rPr>
+                <w:sz w:val="19"/>
+              </w:rPr>
+              <w:t>35.66</w:t>
+            </w:r>
+          </w:p>
+        </w:tc>
+        <w:tc>
+          <w:tcPr>
+            <w:tcW w:type="dxa" w:w="1584"/>
+          </w:tcPr>
+          <w:p>
+            <w:r>
+              <w:rPr>
+                <w:sz w:val="19"/>
+              </w:rPr>
+              <w:t>0.891</w:t>
+            </w:r>
+          </w:p>
+        </w:tc>
+        <w:tc>
+          <w:tcPr>
+            <w:tcW w:type="dxa" w:w="1584"/>
+          </w:tcPr>
+          <w:p>
+            <w:r>
+              <w:rPr>
+                <w:sz w:val="19"/>
+              </w:rPr>
+              <w:t>2.64</w:t>
+            </w:r>
+          </w:p>
+        </w:tc>
+        <w:tc>
+          <w:tcPr>
+            <w:tcW w:type="dxa" w:w="1728"/>
+          </w:tcPr>
+          <w:p>
+            <w:r>
+              <w:rPr>
+                <w:sz w:val="19"/>
+              </w:rPr>
+              <w:t>0.0419</w:t>
+            </w:r>
+          </w:p>
+        </w:tc>
+        <w:tc>
+          <w:tcPr>
+            <w:tcW w:type="dxa" w:w="1584"/>
+          </w:tcPr>
+          <w:p>
+            <w:r>
+              <w:rPr>
+                <w:sz w:val="19"/>
+              </w:rPr>
+              <w:t>34.27</w:t>
+            </w:r>
+          </w:p>
+        </w:tc>
+      </w:tr>
+      <w:tr>
+        <w:tc>
+          <w:tcPr>
+            <w:tcW w:type="dxa" w:w="1296"/>
+          </w:tcPr>
+          <w:p>
+            <w:r>
+              <w:rPr>
+                <w:sz w:val="19"/>
+              </w:rPr>
+              <w:t>13,500</w:t>
+            </w:r>
+          </w:p>
+        </w:tc>
+        <w:tc>
+          <w:tcPr>
+            <w:tcW w:type="dxa" w:w="1584"/>
+          </w:tcPr>
+          <w:p>
+            <w:r>
+              <w:rPr>
+                <w:sz w:val="19"/>
+              </w:rPr>
+              <w:t>35.75</w:t>
+            </w:r>
+          </w:p>
+        </w:tc>
+        <w:tc>
+          <w:tcPr>
+            <w:tcW w:type="dxa" w:w="1584"/>
+          </w:tcPr>
+          <w:p>
+            <w:r>
+              <w:rPr>
+                <w:sz w:val="19"/>
+              </w:rPr>
+              <w:t>0.893</w:t>
+            </w:r>
+          </w:p>
+        </w:tc>
+        <w:tc>
+          <w:tcPr>
+            <w:tcW w:type="dxa" w:w="1584"/>
+          </w:tcPr>
+          <w:p>
+            <w:r>
+              <w:rPr>
+                <w:sz w:val="19"/>
+              </w:rPr>
+              <w:t>2.61</w:t>
+            </w:r>
+          </w:p>
+        </w:tc>
+        <w:tc>
+          <w:tcPr>
+            <w:tcW w:type="dxa" w:w="1728"/>
+          </w:tcPr>
+          <w:p>
+            <w:r>
+              <w:rPr>
+                <w:sz w:val="19"/>
+              </w:rPr>
+              <w:t>0.0414</w:t>
+            </w:r>
+          </w:p>
+        </w:tc>
+        <w:tc>
+          <w:tcPr>
+            <w:tcW w:type="dxa" w:w="1584"/>
+          </w:tcPr>
+          <w:p>
+            <w:r>
+              <w:rPr>
+                <w:sz w:val="19"/>
+              </w:rPr>
+              <w:t>34.27</w:t>
+            </w:r>
+          </w:p>
+        </w:tc>
+      </w:tr>
+    </w:tbl>
+    <w:p/>
+    <w:p>
+      <w:r>
+        <w:rPr>
+          <w:b w:val="0"/>
+          <w:i w:val="0"/>
+          <w:color w:val="606060"/>
+          <w:sz w:val="18"/>
+        </w:rPr>
+        <w:t>The held-out PSNR climbs from +0.83 dB over bicubic at step 500 to +1.48 dB by step 13,500, then flattens -- which is why the run was stopped there.</w:t>
+      </w:r>
+    </w:p>
     <w:p>
       <w:pPr>
         <w:pStyle w:val="Heading1"/>

</xml_diff>